<commit_message>
Aggiornamento Diagramma V6 e studio documento Categorizzazione
</commit_message>
<xml_diff>
--- a/Project Work.docx
+++ b/Project Work.docx
@@ -4,6 +4,7 @@
   <w:body>
     <w:p>
       <w:pPr>
+        <w:jc w:val="both"/>
         <w:rPr>
           <w:sz w:val="52"/>
           <w:szCs w:val="52"/>
@@ -7261,6 +7262,15 @@
 </file>
 
 <file path=customXml/item2.xml><?xml version="1.0" encoding="utf-8"?>
+<?mso-contentType ?>
+<FormTemplates xmlns="http://schemas.microsoft.com/sharepoint/v3/contenttype/forms">
+  <Display>DocumentLibraryForm</Display>
+  <Edit>DocumentLibraryForm</Edit>
+  <New>DocumentLibraryForm</New>
+</FormTemplates>
+</file>
+
+<file path=customXml/item3.xml><?xml version="1.0" encoding="utf-8"?>
 <ct:contentTypeSchema xmlns:ct="http://schemas.microsoft.com/office/2006/metadata/contentType" xmlns:ma="http://schemas.microsoft.com/office/2006/metadata/properties/metaAttributes" ct:_="" ma:_="" ma:contentTypeName="Document" ma:contentTypeID="0x010100985297931832C94E99473DBCA249F4E8" ma:contentTypeVersion="6" ma:contentTypeDescription="Create a new document." ma:contentTypeScope="" ma:versionID="f5984f892599da0ac604c774aa0c92a3">
   <xsd:schema xmlns:xsd="http://www.w3.org/2001/XMLSchema" xmlns:xs="http://www.w3.org/2001/XMLSchema" xmlns:p="http://schemas.microsoft.com/office/2006/metadata/properties" xmlns:ns3="e406b80f-5f20-41f2-bdc4-39424ac55016" targetNamespace="http://schemas.microsoft.com/office/2006/metadata/properties" ma:root="true" ma:fieldsID="e3a87bf05483bbec8d2e13a5dc03f026" ns3:_="">
     <xsd:import namespace="e406b80f-5f20-41f2-bdc4-39424ac55016"/>
@@ -7416,15 +7426,6 @@
 </ct:contentTypeSchema>
 </file>
 
-<file path=customXml/item3.xml><?xml version="1.0" encoding="utf-8"?>
-<?mso-contentType ?>
-<FormTemplates xmlns="http://schemas.microsoft.com/sharepoint/v3/contenttype/forms">
-  <Display>DocumentLibraryForm</Display>
-  <Edit>DocumentLibraryForm</Edit>
-  <New>DocumentLibraryForm</New>
-</FormTemplates>
-</file>
-
 <file path=customXml/itemProps1.xml><?xml version="1.0" encoding="utf-8"?>
 <ds:datastoreItem xmlns:ds="http://schemas.openxmlformats.org/officeDocument/2006/customXml" ds:itemID="{DDC2C775-BA78-40F3-887F-8626F4CEF7B9}">
   <ds:schemaRefs>
@@ -7436,6 +7437,14 @@
 </file>
 
 <file path=customXml/itemProps2.xml><?xml version="1.0" encoding="utf-8"?>
+<ds:datastoreItem xmlns:ds="http://schemas.openxmlformats.org/officeDocument/2006/customXml" ds:itemID="{40645CF5-EA58-46CB-BBB6-B9E24CAE9CE4}">
+  <ds:schemaRefs>
+    <ds:schemaRef ds:uri="http://schemas.microsoft.com/sharepoint/v3/contenttype/forms"/>
+  </ds:schemaRefs>
+</ds:datastoreItem>
+</file>
+
+<file path=customXml/itemProps3.xml><?xml version="1.0" encoding="utf-8"?>
 <ds:datastoreItem xmlns:ds="http://schemas.openxmlformats.org/officeDocument/2006/customXml" ds:itemID="{C9FC01BB-F372-4DF9-B0F0-DD47460894D4}">
   <ds:schemaRefs>
     <ds:schemaRef ds:uri="http://schemas.microsoft.com/office/2006/metadata/contentType"/>
@@ -7451,12 +7460,4 @@
     <ds:schemaRef ds:uri="http://schemas.microsoft.com/internal/obd"/>
   </ds:schemaRefs>
 </ds:datastoreItem>
-</file>
-
-<file path=customXml/itemProps3.xml><?xml version="1.0" encoding="utf-8"?>
-<ds:datastoreItem xmlns:ds="http://schemas.openxmlformats.org/officeDocument/2006/customXml" ds:itemID="{40645CF5-EA58-46CB-BBB6-B9E24CAE9CE4}">
-  <ds:schemaRefs>
-    <ds:schemaRef ds:uri="http://schemas.microsoft.com/sharepoint/v3/contenttype/forms"/>
-  </ds:schemaRefs>
-</ds:datastoreItem>
 </file>
</xml_diff>